<commit_message>
todo terminado en raphsody
</commit_message>
<xml_diff>
--- a/3_SISTEMA/ECU_Listar_Repuestos.docx
+++ b/3_SISTEMA/ECU_Listar_Repuestos.docx
@@ -1368,6 +1368,42 @@
           <w:sz w:val="24"/>
           <w:szCs w:val="24"/>
         </w:rPr>
+        <w:t>el</w:t>
+      </w:r>
+      <w:proofErr w:type="spellEnd"/>
+      <w:r>
+        <w:rPr>
+          <w:rFonts w:ascii="Arial" w:hAnsi="Arial" w:cs="Arial"/>
+          <w:sz w:val="24"/>
+          <w:szCs w:val="24"/>
+        </w:rPr>
+        <w:t xml:space="preserve"> </w:t>
+      </w:r>
+      <w:proofErr w:type="spellStart"/>
+      <w:r>
+        <w:rPr>
+          <w:rFonts w:ascii="Arial" w:hAnsi="Arial" w:cs="Arial"/>
+          <w:sz w:val="24"/>
+          <w:szCs w:val="24"/>
+        </w:rPr>
+        <w:t>boton</w:t>
+      </w:r>
+      <w:proofErr w:type="spellEnd"/>
+      <w:r>
+        <w:rPr>
+          <w:rFonts w:ascii="Arial" w:hAnsi="Arial" w:cs="Arial"/>
+          <w:sz w:val="24"/>
+          <w:szCs w:val="24"/>
+        </w:rPr>
+        <w:t xml:space="preserve"> </w:t>
+      </w:r>
+      <w:proofErr w:type="spellStart"/>
+      <w:r>
+        <w:rPr>
+          <w:rFonts w:ascii="Arial" w:hAnsi="Arial" w:cs="Arial"/>
+          <w:sz w:val="24"/>
+          <w:szCs w:val="24"/>
+        </w:rPr>
         <w:t>Listar</w:t>
       </w:r>
       <w:proofErr w:type="spellEnd"/>
@@ -1443,7 +1479,7 @@
           <w:sz w:val="24"/>
           <w:szCs w:val="24"/>
         </w:rPr>
-        <w:t>lista</w:t>
+        <w:t>muestra</w:t>
       </w:r>
       <w:proofErr w:type="spellEnd"/>
       <w:r>
@@ -1452,6 +1488,24 @@
           <w:sz w:val="24"/>
           <w:szCs w:val="24"/>
         </w:rPr>
+        <w:t xml:space="preserve"> la </w:t>
+      </w:r>
+      <w:proofErr w:type="spellStart"/>
+      <w:r>
+        <w:rPr>
+          <w:rFonts w:ascii="Arial" w:hAnsi="Arial" w:cs="Arial"/>
+          <w:sz w:val="24"/>
+          <w:szCs w:val="24"/>
+        </w:rPr>
+        <w:t>interfaz</w:t>
+      </w:r>
+      <w:proofErr w:type="spellEnd"/>
+      <w:r>
+        <w:rPr>
+          <w:rFonts w:ascii="Arial" w:hAnsi="Arial" w:cs="Arial"/>
+          <w:sz w:val="24"/>
+          <w:szCs w:val="24"/>
+        </w:rPr>
         <w:t xml:space="preserve"> </w:t>
       </w:r>
       <w:proofErr w:type="spellStart"/>
@@ -1461,7 +1515,7 @@
           <w:sz w:val="24"/>
           <w:szCs w:val="24"/>
         </w:rPr>
-        <w:t>todos</w:t>
+        <w:t>Listar</w:t>
       </w:r>
       <w:proofErr w:type="spellEnd"/>
       <w:r>
@@ -1479,43 +1533,7 @@
           <w:sz w:val="24"/>
           <w:szCs w:val="24"/>
         </w:rPr>
-        <w:t>los</w:t>
-      </w:r>
-      <w:proofErr w:type="spellEnd"/>
-      <w:r>
-        <w:rPr>
-          <w:rFonts w:ascii="Arial" w:hAnsi="Arial" w:cs="Arial"/>
-          <w:sz w:val="24"/>
-          <w:szCs w:val="24"/>
-        </w:rPr>
-        <w:t xml:space="preserve"> </w:t>
-      </w:r>
-      <w:proofErr w:type="spellStart"/>
-      <w:r>
-        <w:rPr>
-          <w:rFonts w:ascii="Arial" w:hAnsi="Arial" w:cs="Arial"/>
-          <w:sz w:val="24"/>
-          <w:szCs w:val="24"/>
-        </w:rPr>
-        <w:t>repuestos</w:t>
-      </w:r>
-      <w:proofErr w:type="spellEnd"/>
-      <w:r>
-        <w:rPr>
-          <w:rFonts w:ascii="Arial" w:hAnsi="Arial" w:cs="Arial"/>
-          <w:sz w:val="24"/>
-          <w:szCs w:val="24"/>
-        </w:rPr>
-        <w:t xml:space="preserve"> </w:t>
-      </w:r>
-      <w:proofErr w:type="spellStart"/>
-      <w:r>
-        <w:rPr>
-          <w:rFonts w:ascii="Arial" w:hAnsi="Arial" w:cs="Arial"/>
-          <w:sz w:val="24"/>
-          <w:szCs w:val="24"/>
-        </w:rPr>
-        <w:t>disponibles</w:t>
+        <w:t>Repuestos</w:t>
       </w:r>
       <w:proofErr w:type="spellEnd"/>
       <w:r>
@@ -1657,6 +1675,111 @@
         </w:rPr>
         <w:t>.</w:t>
       </w:r>
+    </w:p>
+    <w:p>
+      <w:pPr>
+        <w:widowControl/>
+        <w:numPr>
+          <w:ilvl w:val="0"/>
+          <w:numId w:val="41"/>
+        </w:numPr>
+        <w:spacing w:before="100" w:beforeAutospacing="1" w:after="100" w:afterAutospacing="1" w:line="240" w:lineRule="auto"/>
+        <w:rPr>
+          <w:rFonts w:ascii="Arial" w:hAnsi="Arial" w:cs="Arial"/>
+          <w:sz w:val="24"/>
+          <w:szCs w:val="24"/>
+        </w:rPr>
+      </w:pPr>
+      <w:r>
+        <w:rPr>
+          <w:rFonts w:ascii="Arial" w:hAnsi="Arial" w:cs="Arial"/>
+          <w:sz w:val="24"/>
+          <w:szCs w:val="24"/>
+        </w:rPr>
+        <w:t xml:space="preserve">El </w:t>
+      </w:r>
+      <w:proofErr w:type="spellStart"/>
+      <w:r>
+        <w:rPr>
+          <w:rFonts w:ascii="Arial" w:hAnsi="Arial" w:cs="Arial"/>
+          <w:sz w:val="24"/>
+          <w:szCs w:val="24"/>
+        </w:rPr>
+        <w:t>Encargado</w:t>
+      </w:r>
+      <w:proofErr w:type="spellEnd"/>
+      <w:r>
+        <w:rPr>
+          <w:rFonts w:ascii="Arial" w:hAnsi="Arial" w:cs="Arial"/>
+          <w:sz w:val="24"/>
+          <w:szCs w:val="24"/>
+        </w:rPr>
+        <w:t xml:space="preserve"> </w:t>
+      </w:r>
+      <w:proofErr w:type="spellStart"/>
+      <w:r>
+        <w:rPr>
+          <w:rFonts w:ascii="Arial" w:hAnsi="Arial" w:cs="Arial"/>
+          <w:sz w:val="24"/>
+          <w:szCs w:val="24"/>
+        </w:rPr>
+        <w:t>selecciona</w:t>
+      </w:r>
+      <w:proofErr w:type="spellEnd"/>
+      <w:r>
+        <w:rPr>
+          <w:rFonts w:ascii="Arial" w:hAnsi="Arial" w:cs="Arial"/>
+          <w:sz w:val="24"/>
+          <w:szCs w:val="24"/>
+        </w:rPr>
+        <w:t xml:space="preserve"> </w:t>
+      </w:r>
+      <w:proofErr w:type="spellStart"/>
+      <w:r>
+        <w:rPr>
+          <w:rFonts w:ascii="Arial" w:hAnsi="Arial" w:cs="Arial"/>
+          <w:sz w:val="24"/>
+          <w:szCs w:val="24"/>
+        </w:rPr>
+        <w:t>el</w:t>
+      </w:r>
+      <w:proofErr w:type="spellEnd"/>
+      <w:r>
+        <w:rPr>
+          <w:rFonts w:ascii="Arial" w:hAnsi="Arial" w:cs="Arial"/>
+          <w:sz w:val="24"/>
+          <w:szCs w:val="24"/>
+        </w:rPr>
+        <w:t xml:space="preserve"> </w:t>
+      </w:r>
+      <w:proofErr w:type="spellStart"/>
+      <w:r>
+        <w:rPr>
+          <w:rFonts w:ascii="Arial" w:hAnsi="Arial" w:cs="Arial"/>
+          <w:sz w:val="24"/>
+          <w:szCs w:val="24"/>
+        </w:rPr>
+        <w:t>boton</w:t>
+      </w:r>
+      <w:proofErr w:type="spellEnd"/>
+      <w:r>
+        <w:rPr>
+          <w:rFonts w:ascii="Arial" w:hAnsi="Arial" w:cs="Arial"/>
+          <w:sz w:val="24"/>
+          <w:szCs w:val="24"/>
+        </w:rPr>
+        <w:t xml:space="preserve"> </w:t>
+      </w:r>
+      <w:proofErr w:type="spellStart"/>
+      <w:r>
+        <w:rPr>
+          <w:rFonts w:ascii="Arial" w:hAnsi="Arial" w:cs="Arial"/>
+          <w:sz w:val="24"/>
+          <w:szCs w:val="24"/>
+        </w:rPr>
+        <w:t>Buscar</w:t>
+      </w:r>
+      <w:proofErr w:type="spellEnd"/>
     </w:p>
     <w:p>
       <w:pPr>

</xml_diff>